<commit_message>
updated the document with Jdbc crud operation and created one account table in mysql database
</commit_message>
<xml_diff>
--- a/jdbc_concept.docx
+++ b/jdbc_concept.docx
@@ -4072,6 +4072,2066 @@
       <w:proofErr w:type="spellEnd"/>
     </w:p>
     <w:p/>
+    <w:p/>
+    <w:p/>
+    <w:p/>
+    <w:p/>
+    <w:p/>
+    <w:p/>
+    <w:p/>
+    <w:p>
+      <w:pPr>
+        <w:rPr>
+          <w:b/>
+          <w:bCs/>
+          <w:sz w:val="28"/>
+          <w:szCs w:val="28"/>
+        </w:rPr>
+      </w:pPr>
+      <w:r>
+        <w:rPr>
+          <w:b/>
+          <w:bCs/>
+          <w:sz w:val="28"/>
+          <w:szCs w:val="28"/>
+        </w:rPr>
+        <w:t>JDBC setup code :</w:t>
+      </w:r>
+    </w:p>
+    <w:p/>
+    <w:p>
+      <w:r>
+        <w:rPr>
+          <w:b/>
+          <w:bCs/>
+        </w:rPr>
+        <w:t>package</w:t>
+      </w:r>
+      <w:r>
+        <w:t xml:space="preserve"> </w:t>
+      </w:r>
+      <w:proofErr w:type="spellStart"/>
+      <w:r>
+        <w:t>com.jdbc</w:t>
+      </w:r>
+      <w:proofErr w:type="spellEnd"/>
+      <w:r>
+        <w:t>;</w:t>
+      </w:r>
+    </w:p>
+    <w:p>
+      <w:r>
+        <w:rPr>
+          <w:b/>
+          <w:bCs/>
+        </w:rPr>
+        <w:t>import</w:t>
+      </w:r>
+      <w:r>
+        <w:t xml:space="preserve"> </w:t>
+      </w:r>
+      <w:proofErr w:type="spellStart"/>
+      <w:r>
+        <w:t>java.sql</w:t>
+      </w:r>
+      <w:proofErr w:type="spellEnd"/>
+      <w:r>
+        <w:t>.*;</w:t>
+      </w:r>
+    </w:p>
+    <w:p/>
+    <w:p>
+      <w:r>
+        <w:rPr>
+          <w:b/>
+          <w:bCs/>
+        </w:rPr>
+        <w:t>public</w:t>
+      </w:r>
+      <w:r>
+        <w:t xml:space="preserve"> </w:t>
+      </w:r>
+      <w:r>
+        <w:rPr>
+          <w:b/>
+          <w:bCs/>
+        </w:rPr>
+        <w:t>class</w:t>
+      </w:r>
+      <w:r>
+        <w:t xml:space="preserve"> </w:t>
+      </w:r>
+      <w:proofErr w:type="spellStart"/>
+      <w:r>
+        <w:t>JdbcExample</w:t>
+      </w:r>
+      <w:proofErr w:type="spellEnd"/>
+      <w:r>
+        <w:t xml:space="preserve"> {</w:t>
+      </w:r>
+    </w:p>
+    <w:p>
+      <w:r>
+        <w:tab/>
+      </w:r>
+      <w:r>
+        <w:rPr>
+          <w:b/>
+          <w:bCs/>
+        </w:rPr>
+        <w:t>public</w:t>
+      </w:r>
+      <w:r>
+        <w:t xml:space="preserve"> </w:t>
+      </w:r>
+      <w:r>
+        <w:rPr>
+          <w:b/>
+          <w:bCs/>
+        </w:rPr>
+        <w:t>static</w:t>
+      </w:r>
+      <w:r>
+        <w:t xml:space="preserve"> </w:t>
+      </w:r>
+      <w:r>
+        <w:rPr>
+          <w:b/>
+          <w:bCs/>
+        </w:rPr>
+        <w:t>void</w:t>
+      </w:r>
+      <w:r>
+        <w:t xml:space="preserve"> main(String[] </w:t>
+      </w:r>
+      <w:proofErr w:type="spellStart"/>
+      <w:r>
+        <w:t>args</w:t>
+      </w:r>
+      <w:proofErr w:type="spellEnd"/>
+      <w:r>
+        <w:t xml:space="preserve">) </w:t>
+      </w:r>
+      <w:r>
+        <w:rPr>
+          <w:b/>
+          <w:bCs/>
+        </w:rPr>
+        <w:t>throws</w:t>
+      </w:r>
+      <w:r>
+        <w:t xml:space="preserve"> </w:t>
+      </w:r>
+      <w:proofErr w:type="spellStart"/>
+      <w:r>
+        <w:t>SQLException</w:t>
+      </w:r>
+      <w:proofErr w:type="spellEnd"/>
+      <w:r>
+        <w:t xml:space="preserve"> {</w:t>
+      </w:r>
+    </w:p>
+    <w:p>
+      <w:r>
+        <w:tab/>
+      </w:r>
+      <w:r>
+        <w:tab/>
+        <w:t>String user = "root";</w:t>
+      </w:r>
+    </w:p>
+    <w:p>
+      <w:r>
+        <w:tab/>
+      </w:r>
+      <w:r>
+        <w:tab/>
+        <w:t>String password = "</w:t>
+      </w:r>
+      <w:proofErr w:type="spellStart"/>
+      <w:r>
+        <w:t>mysql</w:t>
+      </w:r>
+      <w:proofErr w:type="spellEnd"/>
+      <w:r>
+        <w:t>";</w:t>
+      </w:r>
+    </w:p>
+    <w:p>
+      <w:r>
+        <w:tab/>
+      </w:r>
+      <w:r>
+        <w:tab/>
+        <w:t xml:space="preserve">String </w:t>
+      </w:r>
+      <w:proofErr w:type="spellStart"/>
+      <w:r>
+        <w:t>url</w:t>
+      </w:r>
+      <w:proofErr w:type="spellEnd"/>
+      <w:r>
+        <w:t xml:space="preserve"> = "</w:t>
+      </w:r>
+      <w:proofErr w:type="spellStart"/>
+      <w:r>
+        <w:t>jdbc:mysql</w:t>
+      </w:r>
+      <w:proofErr w:type="spellEnd"/>
+      <w:r>
+        <w:t>://localhost:3306/</w:t>
+      </w:r>
+      <w:proofErr w:type="spellStart"/>
+      <w:r>
+        <w:t>deloitte</w:t>
+      </w:r>
+      <w:proofErr w:type="spellEnd"/>
+      <w:r>
+        <w:t xml:space="preserve">"; </w:t>
+      </w:r>
+    </w:p>
+    <w:p>
+      <w:r>
+        <w:tab/>
+      </w:r>
+    </w:p>
+    <w:p>
+      <w:r>
+        <w:tab/>
+      </w:r>
+    </w:p>
+    <w:p>
+      <w:r>
+        <w:tab/>
+      </w:r>
+      <w:r>
+        <w:rPr>
+          <w:b/>
+          <w:bCs/>
+        </w:rPr>
+        <w:t>try</w:t>
+      </w:r>
+      <w:r>
+        <w:t xml:space="preserve"> {</w:t>
+      </w:r>
+    </w:p>
+    <w:p>
+      <w:r>
+        <w:tab/>
+      </w:r>
+      <w:r>
+        <w:tab/>
+      </w:r>
+      <w:proofErr w:type="spellStart"/>
+      <w:r>
+        <w:t>Class.</w:t>
+      </w:r>
+      <w:r>
+        <w:rPr>
+          <w:i/>
+          <w:iCs/>
+        </w:rPr>
+        <w:t>forName</w:t>
+      </w:r>
+      <w:proofErr w:type="spellEnd"/>
+      <w:r>
+        <w:t>("</w:t>
+      </w:r>
+      <w:proofErr w:type="spellStart"/>
+      <w:r>
+        <w:t>com.mysql.cj.jdbc.Driver</w:t>
+      </w:r>
+      <w:proofErr w:type="spellEnd"/>
+      <w:r>
+        <w:t>");</w:t>
+      </w:r>
+    </w:p>
+    <w:p>
+      <w:r>
+        <w:tab/>
+      </w:r>
+      <w:r>
+        <w:tab/>
+        <w:t xml:space="preserve">Connection con = </w:t>
+      </w:r>
+      <w:proofErr w:type="spellStart"/>
+      <w:r>
+        <w:t>DriverManager.</w:t>
+      </w:r>
+      <w:r>
+        <w:rPr>
+          <w:i/>
+          <w:iCs/>
+        </w:rPr>
+        <w:t>getConnection</w:t>
+      </w:r>
+      <w:proofErr w:type="spellEnd"/>
+      <w:r>
+        <w:t>(</w:t>
+      </w:r>
+      <w:proofErr w:type="spellStart"/>
+      <w:r>
+        <w:t>url,user,password</w:t>
+      </w:r>
+      <w:proofErr w:type="spellEnd"/>
+      <w:r>
+        <w:t>);</w:t>
+      </w:r>
+    </w:p>
+    <w:p>
+      <w:r>
+        <w:tab/>
+      </w:r>
+      <w:r>
+        <w:tab/>
+        <w:t xml:space="preserve">Statement </w:t>
+      </w:r>
+      <w:proofErr w:type="spellStart"/>
+      <w:r>
+        <w:t>st</w:t>
+      </w:r>
+      <w:proofErr w:type="spellEnd"/>
+      <w:r>
+        <w:t xml:space="preserve"> = </w:t>
+      </w:r>
+      <w:proofErr w:type="spellStart"/>
+      <w:r>
+        <w:t>con.createStatement</w:t>
+      </w:r>
+      <w:proofErr w:type="spellEnd"/>
+      <w:r>
+        <w:t>();</w:t>
+      </w:r>
+    </w:p>
+    <w:p>
+      <w:r>
+        <w:tab/>
+      </w:r>
+      <w:r>
+        <w:tab/>
+      </w:r>
+      <w:proofErr w:type="spellStart"/>
+      <w:r>
+        <w:t>ResultSet</w:t>
+      </w:r>
+      <w:proofErr w:type="spellEnd"/>
+      <w:r>
+        <w:t xml:space="preserve"> </w:t>
+      </w:r>
+      <w:proofErr w:type="spellStart"/>
+      <w:r>
+        <w:t>rs</w:t>
+      </w:r>
+      <w:proofErr w:type="spellEnd"/>
+      <w:r>
+        <w:t xml:space="preserve"> = </w:t>
+      </w:r>
+      <w:proofErr w:type="spellStart"/>
+      <w:r>
+        <w:t>st.executeQuery</w:t>
+      </w:r>
+      <w:proofErr w:type="spellEnd"/>
+      <w:r>
+        <w:t>("SELECT * FROM employee");</w:t>
+      </w:r>
+    </w:p>
+    <w:p>
+      <w:r>
+        <w:tab/>
+      </w:r>
+      <w:r>
+        <w:tab/>
+      </w:r>
+      <w:r>
+        <w:rPr>
+          <w:b/>
+          <w:bCs/>
+        </w:rPr>
+        <w:t>while</w:t>
+      </w:r>
+      <w:r>
+        <w:t xml:space="preserve"> (</w:t>
+      </w:r>
+      <w:proofErr w:type="spellStart"/>
+      <w:r>
+        <w:t>rs.next</w:t>
+      </w:r>
+      <w:proofErr w:type="spellEnd"/>
+      <w:r>
+        <w:t>()) {</w:t>
+      </w:r>
+    </w:p>
+    <w:p>
+      <w:r>
+        <w:tab/>
+      </w:r>
+      <w:r>
+        <w:tab/>
+      </w:r>
+      <w:r>
+        <w:tab/>
+      </w:r>
+      <w:proofErr w:type="spellStart"/>
+      <w:r>
+        <w:t>System.</w:t>
+      </w:r>
+      <w:r>
+        <w:rPr>
+          <w:b/>
+          <w:bCs/>
+          <w:i/>
+          <w:iCs/>
+        </w:rPr>
+        <w:t>out</w:t>
+      </w:r>
+      <w:r>
+        <w:t>.println</w:t>
+      </w:r>
+      <w:proofErr w:type="spellEnd"/>
+      <w:r>
+        <w:t xml:space="preserve">("Employee " + </w:t>
+      </w:r>
+      <w:proofErr w:type="spellStart"/>
+      <w:r>
+        <w:t>rs.getInt</w:t>
+      </w:r>
+      <w:proofErr w:type="spellEnd"/>
+      <w:r>
+        <w:t>("id") +</w:t>
+      </w:r>
+    </w:p>
+    <w:p>
+      <w:r>
+        <w:tab/>
+      </w:r>
+      <w:r>
+        <w:tab/>
+      </w:r>
+      <w:r>
+        <w:tab/>
+        <w:t xml:space="preserve">" | name: " + </w:t>
+      </w:r>
+      <w:proofErr w:type="spellStart"/>
+      <w:r>
+        <w:t>rs.getString</w:t>
+      </w:r>
+      <w:proofErr w:type="spellEnd"/>
+      <w:r>
+        <w:t>("name"));</w:t>
+      </w:r>
+    </w:p>
+    <w:p>
+      <w:r>
+        <w:tab/>
+      </w:r>
+      <w:r>
+        <w:tab/>
+      </w:r>
+      <w:r>
+        <w:tab/>
+        <w:t>}</w:t>
+      </w:r>
+    </w:p>
+    <w:p>
+      <w:r>
+        <w:tab/>
+      </w:r>
+      <w:r>
+        <w:tab/>
+      </w:r>
+      <w:proofErr w:type="spellStart"/>
+      <w:r>
+        <w:t>st.close</w:t>
+      </w:r>
+      <w:proofErr w:type="spellEnd"/>
+      <w:r>
+        <w:t>();</w:t>
+      </w:r>
+    </w:p>
+    <w:p>
+      <w:r>
+        <w:tab/>
+      </w:r>
+      <w:r>
+        <w:tab/>
+      </w:r>
+      <w:proofErr w:type="spellStart"/>
+      <w:r>
+        <w:t>con.close</w:t>
+      </w:r>
+      <w:proofErr w:type="spellEnd"/>
+      <w:r>
+        <w:t>();</w:t>
+      </w:r>
+    </w:p>
+    <w:p>
+      <w:r>
+        <w:tab/>
+        <w:t xml:space="preserve">} </w:t>
+      </w:r>
+      <w:r>
+        <w:rPr>
+          <w:b/>
+          <w:bCs/>
+        </w:rPr>
+        <w:t>catch</w:t>
+      </w:r>
+      <w:r>
+        <w:t xml:space="preserve"> (</w:t>
+      </w:r>
+      <w:proofErr w:type="spellStart"/>
+      <w:r>
+        <w:t>ClassNotFoundException</w:t>
+      </w:r>
+      <w:proofErr w:type="spellEnd"/>
+      <w:r>
+        <w:t xml:space="preserve"> e) {</w:t>
+      </w:r>
+    </w:p>
+    <w:p>
+      <w:r>
+        <w:tab/>
+      </w:r>
+      <w:r>
+        <w:tab/>
+      </w:r>
+    </w:p>
+    <w:p>
+      <w:r>
+        <w:lastRenderedPageBreak/>
+        <w:tab/>
+      </w:r>
+      <w:r>
+        <w:tab/>
+      </w:r>
+      <w:proofErr w:type="spellStart"/>
+      <w:r>
+        <w:t>e.printStackTrace</w:t>
+      </w:r>
+      <w:proofErr w:type="spellEnd"/>
+      <w:r>
+        <w:t>();</w:t>
+      </w:r>
+    </w:p>
+    <w:p>
+      <w:r>
+        <w:tab/>
+        <w:t>}</w:t>
+      </w:r>
+    </w:p>
+    <w:p/>
+    <w:p>
+      <w:r>
+        <w:t>}</w:t>
+      </w:r>
+    </w:p>
+    <w:p>
+      <w:pPr>
+        <w:rPr>
+          <w:b/>
+          <w:bCs/>
+          <w:sz w:val="28"/>
+          <w:szCs w:val="28"/>
+        </w:rPr>
+      </w:pPr>
+      <w:r>
+        <w:t>}</w:t>
+      </w:r>
+      <w:r>
+        <w:rPr>
+          <w:b/>
+          <w:bCs/>
+          <w:sz w:val="28"/>
+          <w:szCs w:val="28"/>
+        </w:rPr>
+        <w:t xml:space="preserve"> </w:t>
+      </w:r>
+    </w:p>
+    <w:p>
+      <w:r>
+        <w:rPr>
+          <w:b/>
+          <w:bCs/>
+          <w:sz w:val="28"/>
+          <w:szCs w:val="28"/>
+        </w:rPr>
+        <w:t xml:space="preserve">JDBC </w:t>
+      </w:r>
+      <w:r>
+        <w:rPr>
+          <w:b/>
+          <w:bCs/>
+          <w:sz w:val="28"/>
+          <w:szCs w:val="28"/>
+        </w:rPr>
+        <w:t xml:space="preserve"> insert operation code:</w:t>
+      </w:r>
+    </w:p>
+    <w:p>
+      <w:r>
+        <w:br/>
+      </w:r>
+      <w:r>
+        <w:rPr>
+          <w:b/>
+          <w:bCs/>
+        </w:rPr>
+        <w:t>package</w:t>
+      </w:r>
+      <w:r>
+        <w:t xml:space="preserve"> </w:t>
+      </w:r>
+      <w:proofErr w:type="spellStart"/>
+      <w:r>
+        <w:t>com.jdbc</w:t>
+      </w:r>
+      <w:proofErr w:type="spellEnd"/>
+      <w:r>
+        <w:t>;</w:t>
+      </w:r>
+    </w:p>
+    <w:p/>
+    <w:p>
+      <w:r>
+        <w:rPr>
+          <w:b/>
+          <w:bCs/>
+        </w:rPr>
+        <w:t>import</w:t>
+      </w:r>
+      <w:r>
+        <w:t xml:space="preserve"> </w:t>
+      </w:r>
+      <w:proofErr w:type="spellStart"/>
+      <w:r>
+        <w:t>java.sql</w:t>
+      </w:r>
+      <w:proofErr w:type="spellEnd"/>
+      <w:r>
+        <w:t>.*;</w:t>
+      </w:r>
+    </w:p>
+    <w:p>
+      <w:r>
+        <w:rPr>
+          <w:b/>
+          <w:bCs/>
+        </w:rPr>
+        <w:t>class</w:t>
+      </w:r>
+      <w:r>
+        <w:t xml:space="preserve"> </w:t>
+      </w:r>
+      <w:proofErr w:type="spellStart"/>
+      <w:r>
+        <w:t>AccountStoringApplication</w:t>
+      </w:r>
+      <w:proofErr w:type="spellEnd"/>
+    </w:p>
+    <w:p>
+      <w:r>
+        <w:t>{</w:t>
+      </w:r>
+    </w:p>
+    <w:p>
+      <w:r>
+        <w:t xml:space="preserve">    </w:t>
+      </w:r>
+      <w:r>
+        <w:rPr>
+          <w:b/>
+          <w:bCs/>
+        </w:rPr>
+        <w:t>public</w:t>
+      </w:r>
+      <w:r>
+        <w:t xml:space="preserve"> </w:t>
+      </w:r>
+      <w:r>
+        <w:rPr>
+          <w:b/>
+          <w:bCs/>
+        </w:rPr>
+        <w:t>static</w:t>
+      </w:r>
+      <w:r>
+        <w:t xml:space="preserve"> </w:t>
+      </w:r>
+      <w:r>
+        <w:rPr>
+          <w:b/>
+          <w:bCs/>
+        </w:rPr>
+        <w:t>void</w:t>
+      </w:r>
+      <w:r>
+        <w:t xml:space="preserve"> main(String[] </w:t>
+      </w:r>
+      <w:proofErr w:type="spellStart"/>
+      <w:r>
+        <w:t>args</w:t>
+      </w:r>
+      <w:proofErr w:type="spellEnd"/>
+      <w:r>
+        <w:t xml:space="preserve">) </w:t>
+      </w:r>
+      <w:r>
+        <w:rPr>
+          <w:b/>
+          <w:bCs/>
+        </w:rPr>
+        <w:t>throws</w:t>
+      </w:r>
+      <w:r>
+        <w:t xml:space="preserve"> </w:t>
+      </w:r>
+      <w:proofErr w:type="spellStart"/>
+      <w:r>
+        <w:t>ClassNotFoundException</w:t>
+      </w:r>
+      <w:proofErr w:type="spellEnd"/>
+      <w:r>
+        <w:t xml:space="preserve">, </w:t>
+      </w:r>
+      <w:proofErr w:type="spellStart"/>
+      <w:r>
+        <w:t>SQLException</w:t>
+      </w:r>
+      <w:proofErr w:type="spellEnd"/>
+    </w:p>
+    <w:p>
+      <w:r>
+        <w:t xml:space="preserve">    {</w:t>
+      </w:r>
+    </w:p>
+    <w:p>
+      <w:r>
+        <w:t xml:space="preserve">    </w:t>
+      </w:r>
+      <w:r>
+        <w:tab/>
+        <w:t>String user = "root";</w:t>
+      </w:r>
+    </w:p>
+    <w:p>
+      <w:r>
+        <w:tab/>
+      </w:r>
+      <w:r>
+        <w:tab/>
+        <w:t>String password = "</w:t>
+      </w:r>
+      <w:proofErr w:type="spellStart"/>
+      <w:r>
+        <w:t>mysql</w:t>
+      </w:r>
+      <w:proofErr w:type="spellEnd"/>
+      <w:r>
+        <w:t>";</w:t>
+      </w:r>
+    </w:p>
+    <w:p>
+      <w:r>
+        <w:tab/>
+      </w:r>
+      <w:r>
+        <w:tab/>
+        <w:t xml:space="preserve">String </w:t>
+      </w:r>
+      <w:proofErr w:type="spellStart"/>
+      <w:r>
+        <w:t>url</w:t>
+      </w:r>
+      <w:proofErr w:type="spellEnd"/>
+      <w:r>
+        <w:t xml:space="preserve"> = "</w:t>
+      </w:r>
+      <w:proofErr w:type="spellStart"/>
+      <w:r>
+        <w:t>jdbc:mysql</w:t>
+      </w:r>
+      <w:proofErr w:type="spellEnd"/>
+      <w:r>
+        <w:t>://localhost:3306/</w:t>
+      </w:r>
+      <w:proofErr w:type="spellStart"/>
+      <w:r>
+        <w:t>deloitte</w:t>
+      </w:r>
+      <w:proofErr w:type="spellEnd"/>
+      <w:r>
+        <w:t>";</w:t>
+      </w:r>
+    </w:p>
+    <w:p>
+      <w:r>
+        <w:tab/>
+      </w:r>
+      <w:r>
+        <w:tab/>
+      </w:r>
+    </w:p>
+    <w:p>
+      <w:r>
+        <w:tab/>
+      </w:r>
+      <w:r>
+        <w:tab/>
+      </w:r>
+      <w:proofErr w:type="spellStart"/>
+      <w:r>
+        <w:t>Class.</w:t>
+      </w:r>
+      <w:r>
+        <w:rPr>
+          <w:i/>
+          <w:iCs/>
+        </w:rPr>
+        <w:t>forName</w:t>
+      </w:r>
+      <w:proofErr w:type="spellEnd"/>
+      <w:r>
+        <w:t>("</w:t>
+      </w:r>
+      <w:proofErr w:type="spellStart"/>
+      <w:r>
+        <w:t>com.mysql.cj.jdbc.Driver</w:t>
+      </w:r>
+      <w:proofErr w:type="spellEnd"/>
+      <w:r>
+        <w:t>");</w:t>
+      </w:r>
+    </w:p>
+    <w:p>
+      <w:r>
+        <w:tab/>
+      </w:r>
+      <w:r>
+        <w:tab/>
+        <w:t xml:space="preserve">Connection con = </w:t>
+      </w:r>
+      <w:proofErr w:type="spellStart"/>
+      <w:r>
+        <w:t>DriverManager.</w:t>
+      </w:r>
+      <w:r>
+        <w:rPr>
+          <w:i/>
+          <w:iCs/>
+        </w:rPr>
+        <w:t>getConnection</w:t>
+      </w:r>
+      <w:proofErr w:type="spellEnd"/>
+      <w:r>
+        <w:t>(</w:t>
+      </w:r>
+      <w:proofErr w:type="spellStart"/>
+      <w:r>
+        <w:t>url,user,password</w:t>
+      </w:r>
+      <w:proofErr w:type="spellEnd"/>
+      <w:r>
+        <w:t>);</w:t>
+      </w:r>
+    </w:p>
+    <w:p>
+      <w:r>
+        <w:t xml:space="preserve">        Statement </w:t>
+      </w:r>
+      <w:proofErr w:type="spellStart"/>
+      <w:r>
+        <w:t>st</w:t>
+      </w:r>
+      <w:proofErr w:type="spellEnd"/>
+      <w:r>
+        <w:t xml:space="preserve"> = </w:t>
+      </w:r>
+      <w:proofErr w:type="spellStart"/>
+      <w:r>
+        <w:t>con.createStatement</w:t>
+      </w:r>
+      <w:proofErr w:type="spellEnd"/>
+      <w:r>
+        <w:t>();</w:t>
+      </w:r>
+    </w:p>
+    <w:p>
+      <w:r>
+        <w:t xml:space="preserve">        </w:t>
+      </w:r>
+      <w:r>
+        <w:rPr>
+          <w:b/>
+          <w:bCs/>
+        </w:rPr>
+        <w:t>int</w:t>
+      </w:r>
+      <w:r>
+        <w:t xml:space="preserve"> c = </w:t>
+      </w:r>
+      <w:proofErr w:type="spellStart"/>
+      <w:r>
+        <w:t>st.executeUpdate</w:t>
+      </w:r>
+      <w:proofErr w:type="spellEnd"/>
+      <w:r>
+        <w:t>("insert into account values(1004, 'Preeti', 2345)");</w:t>
+      </w:r>
+    </w:p>
+    <w:p>
+      <w:r>
+        <w:t xml:space="preserve">        </w:t>
+      </w:r>
+      <w:proofErr w:type="spellStart"/>
+      <w:r>
+        <w:t>System.</w:t>
+      </w:r>
+      <w:r>
+        <w:rPr>
+          <w:b/>
+          <w:bCs/>
+          <w:i/>
+          <w:iCs/>
+        </w:rPr>
+        <w:t>out</w:t>
+      </w:r>
+      <w:r>
+        <w:t>.println</w:t>
+      </w:r>
+      <w:proofErr w:type="spellEnd"/>
+      <w:r>
+        <w:t>(c + "account stored successfully");</w:t>
+      </w:r>
+    </w:p>
+    <w:p>
+      <w:r>
+        <w:t xml:space="preserve">        </w:t>
+      </w:r>
+      <w:r>
+        <w:rPr>
+          <w:b/>
+          <w:bCs/>
+        </w:rPr>
+        <w:t>int</w:t>
+      </w:r>
+      <w:r>
+        <w:t xml:space="preserve"> c1 = </w:t>
+      </w:r>
+      <w:proofErr w:type="spellStart"/>
+      <w:r>
+        <w:t>st.executeUpdate</w:t>
+      </w:r>
+      <w:proofErr w:type="spellEnd"/>
+      <w:r>
+        <w:t>("insert into account values(1008, 'Sachin', 5345)");</w:t>
+      </w:r>
+    </w:p>
+    <w:p>
+      <w:r>
+        <w:t xml:space="preserve">        </w:t>
+      </w:r>
+      <w:proofErr w:type="spellStart"/>
+      <w:r>
+        <w:t>System.</w:t>
+      </w:r>
+      <w:r>
+        <w:rPr>
+          <w:b/>
+          <w:bCs/>
+          <w:i/>
+          <w:iCs/>
+        </w:rPr>
+        <w:t>out</w:t>
+      </w:r>
+      <w:r>
+        <w:t>.println</w:t>
+      </w:r>
+      <w:proofErr w:type="spellEnd"/>
+      <w:r>
+        <w:t>(c1 +  "more account stored successfully");</w:t>
+      </w:r>
+    </w:p>
+    <w:p>
+      <w:r>
+        <w:t xml:space="preserve">        </w:t>
+      </w:r>
+      <w:r>
+        <w:rPr>
+          <w:b/>
+          <w:bCs/>
+        </w:rPr>
+        <w:t>int</w:t>
+      </w:r>
+      <w:r>
+        <w:t xml:space="preserve"> c2 = </w:t>
+      </w:r>
+      <w:proofErr w:type="spellStart"/>
+      <w:r>
+        <w:t>st.executeUpdate</w:t>
+      </w:r>
+      <w:proofErr w:type="spellEnd"/>
+      <w:r>
+        <w:t>("insert into account values(1009,'Anisha', 5678)");</w:t>
+      </w:r>
+    </w:p>
+    <w:p>
+      <w:r>
+        <w:lastRenderedPageBreak/>
+        <w:t xml:space="preserve">        </w:t>
+      </w:r>
+      <w:proofErr w:type="spellStart"/>
+      <w:r>
+        <w:t>System.</w:t>
+      </w:r>
+      <w:r>
+        <w:rPr>
+          <w:b/>
+          <w:bCs/>
+          <w:i/>
+          <w:iCs/>
+        </w:rPr>
+        <w:t>out</w:t>
+      </w:r>
+      <w:r>
+        <w:t>.println</w:t>
+      </w:r>
+      <w:proofErr w:type="spellEnd"/>
+      <w:r>
+        <w:t>(c2 +  "more account stored successfully");</w:t>
+      </w:r>
+    </w:p>
+    <w:p>
+      <w:r>
+        <w:t xml:space="preserve">        </w:t>
+      </w:r>
+      <w:proofErr w:type="spellStart"/>
+      <w:r>
+        <w:t>st.close</w:t>
+      </w:r>
+      <w:proofErr w:type="spellEnd"/>
+      <w:r>
+        <w:t>();</w:t>
+      </w:r>
+    </w:p>
+    <w:p>
+      <w:r>
+        <w:t xml:space="preserve">        </w:t>
+      </w:r>
+      <w:proofErr w:type="spellStart"/>
+      <w:r>
+        <w:t>con.close</w:t>
+      </w:r>
+      <w:proofErr w:type="spellEnd"/>
+      <w:r>
+        <w:t>();</w:t>
+      </w:r>
+    </w:p>
+    <w:p>
+      <w:r>
+        <w:t xml:space="preserve">    }</w:t>
+      </w:r>
+    </w:p>
+    <w:p>
+      <w:r>
+        <w:t>}</w:t>
+      </w:r>
+    </w:p>
+    <w:p/>
+    <w:p>
+      <w:pPr>
+        <w:rPr>
+          <w:b/>
+          <w:bCs/>
+          <w:sz w:val="28"/>
+          <w:szCs w:val="28"/>
+        </w:rPr>
+      </w:pPr>
+      <w:r>
+        <w:rPr>
+          <w:b/>
+          <w:bCs/>
+          <w:sz w:val="28"/>
+          <w:szCs w:val="28"/>
+        </w:rPr>
+        <w:t>JDBC update operation code:</w:t>
+      </w:r>
+    </w:p>
+    <w:p>
+      <w:r>
+        <w:rPr>
+          <w:b/>
+          <w:bCs/>
+        </w:rPr>
+        <w:t>package</w:t>
+      </w:r>
+      <w:r>
+        <w:t xml:space="preserve"> </w:t>
+      </w:r>
+      <w:proofErr w:type="spellStart"/>
+      <w:r>
+        <w:t>com.jdbc</w:t>
+      </w:r>
+      <w:proofErr w:type="spellEnd"/>
+      <w:r>
+        <w:t>;</w:t>
+      </w:r>
+    </w:p>
+    <w:p/>
+    <w:p>
+      <w:r>
+        <w:rPr>
+          <w:b/>
+          <w:bCs/>
+        </w:rPr>
+        <w:t>import</w:t>
+      </w:r>
+      <w:r>
+        <w:t xml:space="preserve"> </w:t>
+      </w:r>
+      <w:proofErr w:type="spellStart"/>
+      <w:r>
+        <w:t>java.sql</w:t>
+      </w:r>
+      <w:proofErr w:type="spellEnd"/>
+      <w:r>
+        <w:t>.*;</w:t>
+      </w:r>
+    </w:p>
+    <w:p>
+      <w:r>
+        <w:rPr>
+          <w:b/>
+          <w:bCs/>
+        </w:rPr>
+        <w:t>class</w:t>
+      </w:r>
+      <w:r>
+        <w:t xml:space="preserve"> </w:t>
+      </w:r>
+      <w:proofErr w:type="spellStart"/>
+      <w:r>
+        <w:t>UpdateAccountApplication</w:t>
+      </w:r>
+      <w:proofErr w:type="spellEnd"/>
+      <w:r>
+        <w:t xml:space="preserve"> </w:t>
+      </w:r>
+    </w:p>
+    <w:p>
+      <w:r>
+        <w:t>{</w:t>
+      </w:r>
+    </w:p>
+    <w:p>
+      <w:r>
+        <w:t xml:space="preserve">    </w:t>
+      </w:r>
+      <w:r>
+        <w:rPr>
+          <w:b/>
+          <w:bCs/>
+        </w:rPr>
+        <w:t>public</w:t>
+      </w:r>
+      <w:r>
+        <w:t xml:space="preserve"> </w:t>
+      </w:r>
+      <w:r>
+        <w:rPr>
+          <w:b/>
+          <w:bCs/>
+        </w:rPr>
+        <w:t>static</w:t>
+      </w:r>
+      <w:r>
+        <w:t xml:space="preserve"> </w:t>
+      </w:r>
+      <w:r>
+        <w:rPr>
+          <w:b/>
+          <w:bCs/>
+        </w:rPr>
+        <w:t>void</w:t>
+      </w:r>
+      <w:r>
+        <w:t xml:space="preserve"> main (String[]</w:t>
+      </w:r>
+      <w:proofErr w:type="spellStart"/>
+      <w:r>
+        <w:t>args</w:t>
+      </w:r>
+      <w:proofErr w:type="spellEnd"/>
+      <w:r>
+        <w:t xml:space="preserve">) </w:t>
+      </w:r>
+      <w:r>
+        <w:rPr>
+          <w:b/>
+          <w:bCs/>
+        </w:rPr>
+        <w:t>throws</w:t>
+      </w:r>
+      <w:r>
+        <w:t xml:space="preserve"> </w:t>
+      </w:r>
+      <w:proofErr w:type="spellStart"/>
+      <w:r>
+        <w:t>ClassNotFoundException</w:t>
+      </w:r>
+      <w:proofErr w:type="spellEnd"/>
+      <w:r>
+        <w:t xml:space="preserve">, </w:t>
+      </w:r>
+      <w:proofErr w:type="spellStart"/>
+      <w:r>
+        <w:t>SQLException</w:t>
+      </w:r>
+      <w:proofErr w:type="spellEnd"/>
+      <w:r>
+        <w:t xml:space="preserve"> </w:t>
+      </w:r>
+    </w:p>
+    <w:p>
+      <w:r>
+        <w:t xml:space="preserve">    {</w:t>
+      </w:r>
+    </w:p>
+    <w:p>
+      <w:r>
+        <w:t xml:space="preserve">    </w:t>
+      </w:r>
+      <w:r>
+        <w:tab/>
+        <w:t>String user = "root";</w:t>
+      </w:r>
+    </w:p>
+    <w:p>
+      <w:r>
+        <w:tab/>
+      </w:r>
+      <w:r>
+        <w:tab/>
+        <w:t>String password = "</w:t>
+      </w:r>
+      <w:proofErr w:type="spellStart"/>
+      <w:r>
+        <w:t>mysql</w:t>
+      </w:r>
+      <w:proofErr w:type="spellEnd"/>
+      <w:r>
+        <w:t>";</w:t>
+      </w:r>
+    </w:p>
+    <w:p>
+      <w:r>
+        <w:tab/>
+      </w:r>
+      <w:r>
+        <w:tab/>
+        <w:t xml:space="preserve">String </w:t>
+      </w:r>
+      <w:proofErr w:type="spellStart"/>
+      <w:r>
+        <w:t>url</w:t>
+      </w:r>
+      <w:proofErr w:type="spellEnd"/>
+      <w:r>
+        <w:t xml:space="preserve"> = "</w:t>
+      </w:r>
+      <w:proofErr w:type="spellStart"/>
+      <w:r>
+        <w:t>jdbc:mysql</w:t>
+      </w:r>
+      <w:proofErr w:type="spellEnd"/>
+      <w:r>
+        <w:t>://localhost:3306/</w:t>
+      </w:r>
+      <w:proofErr w:type="spellStart"/>
+      <w:r>
+        <w:t>deloitte</w:t>
+      </w:r>
+      <w:proofErr w:type="spellEnd"/>
+      <w:r>
+        <w:t xml:space="preserve">"; </w:t>
+      </w:r>
+    </w:p>
+    <w:p>
+      <w:r>
+        <w:t xml:space="preserve">      </w:t>
+      </w:r>
+    </w:p>
+    <w:p>
+      <w:r>
+        <w:tab/>
+      </w:r>
+      <w:r>
+        <w:tab/>
+      </w:r>
+      <w:proofErr w:type="spellStart"/>
+      <w:r>
+        <w:t>Class.</w:t>
+      </w:r>
+      <w:r>
+        <w:rPr>
+          <w:i/>
+          <w:iCs/>
+        </w:rPr>
+        <w:t>forName</w:t>
+      </w:r>
+      <w:proofErr w:type="spellEnd"/>
+      <w:r>
+        <w:t>("</w:t>
+      </w:r>
+      <w:proofErr w:type="spellStart"/>
+      <w:r>
+        <w:t>com.mysql.cj.jdbc.Driver</w:t>
+      </w:r>
+      <w:proofErr w:type="spellEnd"/>
+      <w:r>
+        <w:t>");</w:t>
+      </w:r>
+    </w:p>
+    <w:p>
+      <w:r>
+        <w:tab/>
+      </w:r>
+      <w:r>
+        <w:tab/>
+        <w:t xml:space="preserve">Connection con = </w:t>
+      </w:r>
+      <w:proofErr w:type="spellStart"/>
+      <w:r>
+        <w:t>DriverManager.</w:t>
+      </w:r>
+      <w:r>
+        <w:rPr>
+          <w:i/>
+          <w:iCs/>
+        </w:rPr>
+        <w:t>getConnection</w:t>
+      </w:r>
+      <w:proofErr w:type="spellEnd"/>
+      <w:r>
+        <w:t>(</w:t>
+      </w:r>
+      <w:proofErr w:type="spellStart"/>
+      <w:r>
+        <w:t>url,user,password</w:t>
+      </w:r>
+      <w:proofErr w:type="spellEnd"/>
+      <w:r>
+        <w:t>);</w:t>
+      </w:r>
+    </w:p>
+    <w:p>
+      <w:r>
+        <w:t xml:space="preserve">        Statement </w:t>
+      </w:r>
+      <w:proofErr w:type="spellStart"/>
+      <w:r>
+        <w:t>st</w:t>
+      </w:r>
+      <w:proofErr w:type="spellEnd"/>
+      <w:r>
+        <w:t xml:space="preserve"> = </w:t>
+      </w:r>
+      <w:proofErr w:type="spellStart"/>
+      <w:r>
+        <w:t>con.createStatement</w:t>
+      </w:r>
+      <w:proofErr w:type="spellEnd"/>
+      <w:r>
+        <w:t xml:space="preserve"> ();</w:t>
+      </w:r>
+    </w:p>
+    <w:p>
+      <w:r>
+        <w:t xml:space="preserve">        </w:t>
+      </w:r>
+      <w:r>
+        <w:rPr>
+          <w:b/>
+          <w:bCs/>
+        </w:rPr>
+        <w:t>int</w:t>
+      </w:r>
+      <w:r>
+        <w:t xml:space="preserve"> rows = </w:t>
+      </w:r>
+      <w:proofErr w:type="spellStart"/>
+      <w:r>
+        <w:t>st.executeUpdate</w:t>
+      </w:r>
+      <w:proofErr w:type="spellEnd"/>
+      <w:r>
+        <w:t xml:space="preserve"> ("update account set balance = balance+2000");</w:t>
+      </w:r>
+    </w:p>
+    <w:p>
+      <w:r>
+        <w:t xml:space="preserve">        </w:t>
+      </w:r>
+      <w:proofErr w:type="spellStart"/>
+      <w:r>
+        <w:t>System.</w:t>
+      </w:r>
+      <w:r>
+        <w:rPr>
+          <w:b/>
+          <w:bCs/>
+          <w:i/>
+          <w:iCs/>
+        </w:rPr>
+        <w:t>out</w:t>
+      </w:r>
+      <w:r>
+        <w:t>.println</w:t>
+      </w:r>
+      <w:proofErr w:type="spellEnd"/>
+      <w:r>
+        <w:t xml:space="preserve"> (rows + " rows modified");    </w:t>
+      </w:r>
+    </w:p>
+    <w:p>
+      <w:r>
+        <w:t xml:space="preserve">        </w:t>
+      </w:r>
+      <w:proofErr w:type="spellStart"/>
+      <w:r>
+        <w:t>st.close</w:t>
+      </w:r>
+      <w:proofErr w:type="spellEnd"/>
+      <w:r>
+        <w:t xml:space="preserve"> ();    </w:t>
+      </w:r>
+    </w:p>
+    <w:p>
+      <w:r>
+        <w:t xml:space="preserve">        </w:t>
+      </w:r>
+      <w:proofErr w:type="spellStart"/>
+      <w:r>
+        <w:t>con.close</w:t>
+      </w:r>
+      <w:proofErr w:type="spellEnd"/>
+      <w:r>
+        <w:t xml:space="preserve"> ();</w:t>
+      </w:r>
+    </w:p>
+    <w:p>
+      <w:r>
+        <w:t xml:space="preserve">    } </w:t>
+      </w:r>
+    </w:p>
+    <w:p>
+      <w:r>
+        <w:lastRenderedPageBreak/>
+        <w:t>}</w:t>
+      </w:r>
+    </w:p>
+    <w:p>
+      <w:pPr>
+        <w:rPr>
+          <w:b/>
+          <w:bCs/>
+          <w:sz w:val="28"/>
+          <w:szCs w:val="28"/>
+        </w:rPr>
+      </w:pPr>
+      <w:r>
+        <w:rPr>
+          <w:b/>
+          <w:bCs/>
+          <w:sz w:val="28"/>
+          <w:szCs w:val="28"/>
+        </w:rPr>
+        <w:t>JDBC Delete operation  code:</w:t>
+      </w:r>
+    </w:p>
+    <w:p>
+      <w:r>
+        <w:rPr>
+          <w:b/>
+          <w:bCs/>
+        </w:rPr>
+        <w:t>package</w:t>
+      </w:r>
+      <w:r>
+        <w:t xml:space="preserve"> </w:t>
+      </w:r>
+      <w:proofErr w:type="spellStart"/>
+      <w:r>
+        <w:t>com.jdbc</w:t>
+      </w:r>
+      <w:proofErr w:type="spellEnd"/>
+      <w:r>
+        <w:t>;</w:t>
+      </w:r>
+    </w:p>
+    <w:p/>
+    <w:p>
+      <w:r>
+        <w:rPr>
+          <w:b/>
+          <w:bCs/>
+        </w:rPr>
+        <w:t>import</w:t>
+      </w:r>
+      <w:r>
+        <w:t xml:space="preserve"> </w:t>
+      </w:r>
+      <w:proofErr w:type="spellStart"/>
+      <w:r>
+        <w:t>java.sql</w:t>
+      </w:r>
+      <w:proofErr w:type="spellEnd"/>
+      <w:r>
+        <w:t>.*;</w:t>
+      </w:r>
+    </w:p>
+    <w:p>
+      <w:r>
+        <w:rPr>
+          <w:b/>
+          <w:bCs/>
+        </w:rPr>
+        <w:t>import</w:t>
+      </w:r>
+      <w:r>
+        <w:t xml:space="preserve"> </w:t>
+      </w:r>
+      <w:proofErr w:type="spellStart"/>
+      <w:r>
+        <w:t>java.util</w:t>
+      </w:r>
+      <w:proofErr w:type="spellEnd"/>
+      <w:r>
+        <w:t>.*;</w:t>
+      </w:r>
+    </w:p>
+    <w:p>
+      <w:r>
+        <w:rPr>
+          <w:b/>
+          <w:bCs/>
+        </w:rPr>
+        <w:t>class</w:t>
+      </w:r>
+      <w:r>
+        <w:t xml:space="preserve"> </w:t>
+      </w:r>
+      <w:proofErr w:type="spellStart"/>
+      <w:r>
+        <w:t>AccountCloseApplication</w:t>
+      </w:r>
+      <w:proofErr w:type="spellEnd"/>
+      <w:r>
+        <w:t xml:space="preserve"> </w:t>
+      </w:r>
+    </w:p>
+    <w:p>
+      <w:r>
+        <w:t>{</w:t>
+      </w:r>
+    </w:p>
+    <w:p>
+      <w:r>
+        <w:t xml:space="preserve">    </w:t>
+      </w:r>
+      <w:r>
+        <w:rPr>
+          <w:b/>
+          <w:bCs/>
+        </w:rPr>
+        <w:t>public</w:t>
+      </w:r>
+      <w:r>
+        <w:t xml:space="preserve"> </w:t>
+      </w:r>
+      <w:r>
+        <w:rPr>
+          <w:b/>
+          <w:bCs/>
+        </w:rPr>
+        <w:t>static</w:t>
+      </w:r>
+      <w:r>
+        <w:t xml:space="preserve"> </w:t>
+      </w:r>
+      <w:r>
+        <w:rPr>
+          <w:b/>
+          <w:bCs/>
+        </w:rPr>
+        <w:t>void</w:t>
+      </w:r>
+      <w:r>
+        <w:t xml:space="preserve"> main (String[]</w:t>
+      </w:r>
+      <w:proofErr w:type="spellStart"/>
+      <w:r>
+        <w:t>args</w:t>
+      </w:r>
+      <w:proofErr w:type="spellEnd"/>
+      <w:r>
+        <w:t xml:space="preserve">) </w:t>
+      </w:r>
+      <w:r>
+        <w:rPr>
+          <w:b/>
+          <w:bCs/>
+        </w:rPr>
+        <w:t>throws</w:t>
+      </w:r>
+      <w:r>
+        <w:t xml:space="preserve"> </w:t>
+      </w:r>
+      <w:proofErr w:type="spellStart"/>
+      <w:r>
+        <w:t>ClassNotFoundException</w:t>
+      </w:r>
+      <w:proofErr w:type="spellEnd"/>
+      <w:r>
+        <w:t xml:space="preserve">, </w:t>
+      </w:r>
+      <w:proofErr w:type="spellStart"/>
+      <w:r>
+        <w:t>SQLException</w:t>
+      </w:r>
+      <w:proofErr w:type="spellEnd"/>
+      <w:r>
+        <w:t xml:space="preserve"> </w:t>
+      </w:r>
+    </w:p>
+    <w:p>
+      <w:r>
+        <w:t xml:space="preserve">    {  </w:t>
+      </w:r>
+    </w:p>
+    <w:p>
+      <w:r>
+        <w:t xml:space="preserve">    </w:t>
+      </w:r>
+      <w:r>
+        <w:tab/>
+        <w:t>String user = "root";</w:t>
+      </w:r>
+    </w:p>
+    <w:p>
+      <w:r>
+        <w:tab/>
+      </w:r>
+      <w:r>
+        <w:tab/>
+        <w:t>String password = "</w:t>
+      </w:r>
+      <w:proofErr w:type="spellStart"/>
+      <w:r>
+        <w:t>mysql</w:t>
+      </w:r>
+      <w:proofErr w:type="spellEnd"/>
+      <w:r>
+        <w:t>";</w:t>
+      </w:r>
+    </w:p>
+    <w:p>
+      <w:r>
+        <w:tab/>
+      </w:r>
+      <w:r>
+        <w:tab/>
+        <w:t xml:space="preserve">String </w:t>
+      </w:r>
+      <w:proofErr w:type="spellStart"/>
+      <w:r>
+        <w:t>url</w:t>
+      </w:r>
+      <w:proofErr w:type="spellEnd"/>
+      <w:r>
+        <w:t xml:space="preserve"> = "</w:t>
+      </w:r>
+      <w:proofErr w:type="spellStart"/>
+      <w:r>
+        <w:t>jdbc:mysql</w:t>
+      </w:r>
+      <w:proofErr w:type="spellEnd"/>
+      <w:r>
+        <w:t>://localhost:3306/</w:t>
+      </w:r>
+      <w:proofErr w:type="spellStart"/>
+      <w:r>
+        <w:t>deloitte</w:t>
+      </w:r>
+      <w:proofErr w:type="spellEnd"/>
+      <w:r>
+        <w:t xml:space="preserve">"; </w:t>
+      </w:r>
+    </w:p>
+    <w:p/>
+    <w:p>
+      <w:r>
+        <w:t xml:space="preserve">        Scanner </w:t>
+      </w:r>
+      <w:proofErr w:type="spellStart"/>
+      <w:r>
+        <w:rPr>
+          <w:u w:val="single"/>
+        </w:rPr>
+        <w:t>sc</w:t>
+      </w:r>
+      <w:proofErr w:type="spellEnd"/>
+      <w:r>
+        <w:t xml:space="preserve"> = </w:t>
+      </w:r>
+      <w:r>
+        <w:rPr>
+          <w:b/>
+          <w:bCs/>
+        </w:rPr>
+        <w:t>new</w:t>
+      </w:r>
+      <w:r>
+        <w:t xml:space="preserve"> Scanner (System.</w:t>
+      </w:r>
+      <w:r>
+        <w:rPr>
+          <w:b/>
+          <w:bCs/>
+          <w:i/>
+          <w:iCs/>
+        </w:rPr>
+        <w:t>in</w:t>
+      </w:r>
+      <w:r>
+        <w:t xml:space="preserve">);  </w:t>
+      </w:r>
+    </w:p>
+    <w:p>
+      <w:r>
+        <w:t xml:space="preserve">        </w:t>
+      </w:r>
+      <w:proofErr w:type="spellStart"/>
+      <w:r>
+        <w:t>System.</w:t>
+      </w:r>
+      <w:r>
+        <w:rPr>
+          <w:b/>
+          <w:bCs/>
+          <w:i/>
+          <w:iCs/>
+        </w:rPr>
+        <w:t>out</w:t>
+      </w:r>
+      <w:r>
+        <w:t>.println</w:t>
+      </w:r>
+      <w:proofErr w:type="spellEnd"/>
+      <w:r>
+        <w:t xml:space="preserve"> ("ENTER ACCOUNT NUMBER");   </w:t>
+      </w:r>
+    </w:p>
+    <w:p>
+      <w:r>
+        <w:t xml:space="preserve">        </w:t>
+      </w:r>
+      <w:r>
+        <w:rPr>
+          <w:b/>
+          <w:bCs/>
+        </w:rPr>
+        <w:t>int</w:t>
+      </w:r>
+      <w:r>
+        <w:t xml:space="preserve"> </w:t>
+      </w:r>
+      <w:proofErr w:type="spellStart"/>
+      <w:r>
+        <w:t>ano</w:t>
+      </w:r>
+      <w:proofErr w:type="spellEnd"/>
+      <w:r>
+        <w:t xml:space="preserve"> = </w:t>
+      </w:r>
+      <w:proofErr w:type="spellStart"/>
+      <w:r>
+        <w:t>sc.nextInt</w:t>
+      </w:r>
+      <w:proofErr w:type="spellEnd"/>
+      <w:r>
+        <w:t xml:space="preserve"> ();    </w:t>
+      </w:r>
+    </w:p>
+    <w:p>
+      <w:r>
+        <w:t xml:space="preserve">        </w:t>
+      </w:r>
+      <w:proofErr w:type="spellStart"/>
+      <w:r>
+        <w:t>Class.</w:t>
+      </w:r>
+      <w:r>
+        <w:rPr>
+          <w:i/>
+          <w:iCs/>
+        </w:rPr>
+        <w:t>forName</w:t>
+      </w:r>
+      <w:proofErr w:type="spellEnd"/>
+      <w:r>
+        <w:t>("</w:t>
+      </w:r>
+      <w:proofErr w:type="spellStart"/>
+      <w:r>
+        <w:t>com.mysql.cj.jdbc.Driver</w:t>
+      </w:r>
+      <w:proofErr w:type="spellEnd"/>
+      <w:r>
+        <w:t>");</w:t>
+      </w:r>
+    </w:p>
+    <w:p>
+      <w:r>
+        <w:tab/>
+      </w:r>
+      <w:r>
+        <w:tab/>
+        <w:t xml:space="preserve">Connection con = </w:t>
+      </w:r>
+      <w:proofErr w:type="spellStart"/>
+      <w:r>
+        <w:t>DriverManager.</w:t>
+      </w:r>
+      <w:r>
+        <w:rPr>
+          <w:i/>
+          <w:iCs/>
+        </w:rPr>
+        <w:t>getConnection</w:t>
+      </w:r>
+      <w:proofErr w:type="spellEnd"/>
+      <w:r>
+        <w:t>(</w:t>
+      </w:r>
+      <w:proofErr w:type="spellStart"/>
+      <w:r>
+        <w:t>url,user,password</w:t>
+      </w:r>
+      <w:proofErr w:type="spellEnd"/>
+      <w:r>
+        <w:t>);</w:t>
+      </w:r>
+    </w:p>
+    <w:p>
+      <w:r>
+        <w:t xml:space="preserve">        Statement </w:t>
+      </w:r>
+      <w:proofErr w:type="spellStart"/>
+      <w:r>
+        <w:t>st</w:t>
+      </w:r>
+      <w:proofErr w:type="spellEnd"/>
+      <w:r>
+        <w:t xml:space="preserve"> = </w:t>
+      </w:r>
+      <w:proofErr w:type="spellStart"/>
+      <w:r>
+        <w:t>con.createStatement</w:t>
+      </w:r>
+      <w:proofErr w:type="spellEnd"/>
+      <w:r>
+        <w:t xml:space="preserve"> (); </w:t>
+      </w:r>
+    </w:p>
+    <w:p>
+      <w:r>
+        <w:t xml:space="preserve">        </w:t>
+      </w:r>
+      <w:r>
+        <w:rPr>
+          <w:b/>
+          <w:bCs/>
+        </w:rPr>
+        <w:t>int</w:t>
+      </w:r>
+      <w:r>
+        <w:t xml:space="preserve"> c = </w:t>
+      </w:r>
+      <w:proofErr w:type="spellStart"/>
+      <w:r>
+        <w:t>st.executeUpdate</w:t>
+      </w:r>
+      <w:proofErr w:type="spellEnd"/>
+      <w:r>
+        <w:t xml:space="preserve"> ("delete from account where </w:t>
+      </w:r>
+      <w:proofErr w:type="spellStart"/>
+      <w:r>
+        <w:t>accnonumber</w:t>
+      </w:r>
+      <w:proofErr w:type="spellEnd"/>
+      <w:r>
+        <w:t xml:space="preserve"> =" + </w:t>
+      </w:r>
+      <w:proofErr w:type="spellStart"/>
+      <w:r>
+        <w:t>ano</w:t>
+      </w:r>
+      <w:proofErr w:type="spellEnd"/>
+      <w:r>
+        <w:t>);</w:t>
+      </w:r>
+    </w:p>
+    <w:p>
+      <w:r>
+        <w:t xml:space="preserve">        </w:t>
+      </w:r>
+      <w:r>
+        <w:rPr>
+          <w:b/>
+          <w:bCs/>
+        </w:rPr>
+        <w:t>if</w:t>
+      </w:r>
+      <w:r>
+        <w:t xml:space="preserve"> (c == 0)    </w:t>
+      </w:r>
+    </w:p>
+    <w:p>
+      <w:r>
+        <w:t xml:space="preserve">            </w:t>
+      </w:r>
+      <w:proofErr w:type="spellStart"/>
+      <w:r>
+        <w:t>System.</w:t>
+      </w:r>
+      <w:r>
+        <w:rPr>
+          <w:b/>
+          <w:bCs/>
+          <w:i/>
+          <w:iCs/>
+        </w:rPr>
+        <w:t>out</w:t>
+      </w:r>
+      <w:r>
+        <w:t>.println</w:t>
+      </w:r>
+      <w:proofErr w:type="spellEnd"/>
+      <w:r>
+        <w:t xml:space="preserve"> ("account </w:t>
+      </w:r>
+      <w:proofErr w:type="spellStart"/>
+      <w:r>
+        <w:t>doesnot</w:t>
+      </w:r>
+      <w:proofErr w:type="spellEnd"/>
+      <w:r>
+        <w:t xml:space="preserve"> exist");  </w:t>
+      </w:r>
+    </w:p>
+    <w:p>
+      <w:r>
+        <w:t xml:space="preserve">        </w:t>
+      </w:r>
+      <w:r>
+        <w:rPr>
+          <w:b/>
+          <w:bCs/>
+        </w:rPr>
+        <w:t>else</w:t>
+      </w:r>
+    </w:p>
+    <w:p>
+      <w:r>
+        <w:t xml:space="preserve">            </w:t>
+      </w:r>
+      <w:proofErr w:type="spellStart"/>
+      <w:r>
+        <w:t>System.</w:t>
+      </w:r>
+      <w:r>
+        <w:rPr>
+          <w:b/>
+          <w:bCs/>
+          <w:i/>
+          <w:iCs/>
+        </w:rPr>
+        <w:t>out</w:t>
+      </w:r>
+      <w:r>
+        <w:t>.println</w:t>
+      </w:r>
+      <w:proofErr w:type="spellEnd"/>
+      <w:r>
+        <w:t xml:space="preserve"> ("account closed successfully");</w:t>
+      </w:r>
+    </w:p>
+    <w:p>
+      <w:r>
+        <w:t xml:space="preserve">        </w:t>
+      </w:r>
+      <w:proofErr w:type="spellStart"/>
+      <w:r>
+        <w:t>st.close</w:t>
+      </w:r>
+      <w:proofErr w:type="spellEnd"/>
+      <w:r>
+        <w:t xml:space="preserve"> ();   </w:t>
+      </w:r>
+    </w:p>
+    <w:p>
+      <w:r>
+        <w:lastRenderedPageBreak/>
+        <w:t xml:space="preserve">        </w:t>
+      </w:r>
+      <w:proofErr w:type="spellStart"/>
+      <w:r>
+        <w:t>con.close</w:t>
+      </w:r>
+      <w:proofErr w:type="spellEnd"/>
+      <w:r>
+        <w:t xml:space="preserve"> (); </w:t>
+      </w:r>
+    </w:p>
+    <w:p>
+      <w:r>
+        <w:t xml:space="preserve">    } </w:t>
+      </w:r>
+    </w:p>
+    <w:p>
+      <w:r>
+        <w:t>}</w:t>
+      </w:r>
+    </w:p>
+    <w:p>
+      <w:pPr>
+        <w:rPr>
+          <w:b/>
+          <w:bCs/>
+        </w:rPr>
+      </w:pPr>
+      <w:r>
+        <w:rPr>
+          <w:b/>
+          <w:bCs/>
+        </w:rPr>
+        <w:t>Database Table:</w:t>
+      </w:r>
+    </w:p>
+    <w:p>
+      <w:r>
+        <w:t>CREATE TABLE ACCOUNT (</w:t>
+      </w:r>
+      <w:proofErr w:type="spellStart"/>
+      <w:r>
+        <w:t>accnonumber</w:t>
+      </w:r>
+      <w:proofErr w:type="spellEnd"/>
+      <w:r>
+        <w:t xml:space="preserve"> int primary key, name varchar(12), balance int);</w:t>
+      </w:r>
+    </w:p>
     <w:sectPr>
       <w:pgSz w:w="12240" w:h="15840"/>
       <w:pgMar w:top="1440" w:right="1440" w:bottom="1440" w:left="1440" w:header="720" w:footer="720" w:gutter="0"/>
@@ -7418,6 +9478,17 @@
       <w:shd w:val="clear" w:color="auto" w:fill="E1DFDD"/>
     </w:rPr>
   </w:style>
+  <w:style w:type="paragraph" w:styleId="NormalWeb">
+    <w:name w:val="Normal (Web)"/>
+    <w:basedOn w:val="Normal"/>
+    <w:uiPriority w:val="99"/>
+    <w:semiHidden/>
+    <w:unhideWhenUsed/>
+    <w:rsid w:val="00391043"/>
+    <w:rPr>
+      <w:rFonts w:ascii="Times New Roman" w:hAnsi="Times New Roman" w:cs="Times New Roman"/>
+    </w:rPr>
+  </w:style>
 </w:styles>
 </file>
 

</xml_diff>